<commit_message>
Added KNN and Linear Regression Models
</commit_message>
<xml_diff>
--- a/Used Car Price Prediction Report - Daniel Potapov.docx
+++ b/Used Car Price Prediction Report - Daniel Potapov.docx
@@ -141,6 +141,12 @@
     <w:p>
       <w:pPr>
         <w:pStyle w:val="ListParagraph"/>
+        <w:ind w:left="1440"/>
+      </w:pPr>
+    </w:p>
+    <w:p>
+      <w:pPr>
+        <w:pStyle w:val="ListParagraph"/>
         <w:numPr>
           <w:ilvl w:val="0"/>
           <w:numId w:val="2"/>
@@ -183,12 +189,154 @@
         </w:numPr>
       </w:pPr>
       <w:r>
-        <w:t xml:space="preserve">Data Prepossessing </w:t>
-      </w:r>
-    </w:p>
-    <w:p>
-      <w:r>
-        <w:br w:type="page"/>
+        <w:t>Data Prepossessing</w:t>
+      </w:r>
+    </w:p>
+    <w:p>
+      <w:pPr>
+        <w:pStyle w:val="ListParagraph"/>
+        <w:ind w:left="1440"/>
+      </w:pPr>
+    </w:p>
+    <w:p>
+      <w:pPr>
+        <w:pStyle w:val="ListParagraph"/>
+        <w:numPr>
+          <w:ilvl w:val="0"/>
+          <w:numId w:val="2"/>
+        </w:numPr>
+      </w:pPr>
+      <w:r>
+        <w:t xml:space="preserve">The </w:t>
+      </w:r>
+      <w:r>
+        <w:t>Method</w:t>
+      </w:r>
+    </w:p>
+    <w:p>
+      <w:pPr>
+        <w:pStyle w:val="ListParagraph"/>
+        <w:numPr>
+          <w:ilvl w:val="1"/>
+          <w:numId w:val="2"/>
+        </w:numPr>
+      </w:pPr>
+      <w:r>
+        <w:t>Linear Regression</w:t>
+      </w:r>
+    </w:p>
+    <w:p>
+      <w:pPr>
+        <w:pStyle w:val="ListParagraph"/>
+        <w:numPr>
+          <w:ilvl w:val="1"/>
+          <w:numId w:val="2"/>
+        </w:numPr>
+      </w:pPr>
+      <w:r>
+        <w:t>K -Nearest Neighbors</w:t>
+      </w:r>
+    </w:p>
+    <w:p>
+      <w:pPr>
+        <w:pStyle w:val="ListParagraph"/>
+        <w:ind w:left="1440"/>
+      </w:pPr>
+    </w:p>
+    <w:p>
+      <w:pPr>
+        <w:pStyle w:val="ListParagraph"/>
+        <w:numPr>
+          <w:ilvl w:val="0"/>
+          <w:numId w:val="2"/>
+        </w:numPr>
+      </w:pPr>
+      <w:r>
+        <w:t xml:space="preserve"> </w:t>
+      </w:r>
+      <w:r>
+        <w:t>Results</w:t>
+      </w:r>
+    </w:p>
+    <w:p>
+      <w:pPr>
+        <w:pStyle w:val="ListParagraph"/>
+        <w:numPr>
+          <w:ilvl w:val="1"/>
+          <w:numId w:val="2"/>
+        </w:numPr>
+      </w:pPr>
+      <w:r>
+        <w:t>Linear Regression Results</w:t>
+      </w:r>
+    </w:p>
+    <w:p>
+      <w:pPr>
+        <w:pStyle w:val="ListParagraph"/>
+        <w:numPr>
+          <w:ilvl w:val="1"/>
+          <w:numId w:val="2"/>
+        </w:numPr>
+      </w:pPr>
+      <w:r>
+        <w:t xml:space="preserve">K -Nearest </w:t>
+      </w:r>
+      <w:r>
+        <w:t>Neighbors Results</w:t>
+      </w:r>
+    </w:p>
+    <w:p>
+      <w:pPr>
+        <w:pStyle w:val="ListParagraph"/>
+        <w:ind w:left="1440"/>
+      </w:pPr>
+    </w:p>
+    <w:p>
+      <w:pPr>
+        <w:pStyle w:val="ListParagraph"/>
+        <w:numPr>
+          <w:ilvl w:val="0"/>
+          <w:numId w:val="2"/>
+        </w:numPr>
+      </w:pPr>
+      <w:r>
+        <w:t>Conclusion</w:t>
+      </w:r>
+    </w:p>
+    <w:p>
+      <w:pPr>
+        <w:pStyle w:val="ListParagraph"/>
+        <w:numPr>
+          <w:ilvl w:val="0"/>
+          <w:numId w:val="2"/>
+        </w:numPr>
+      </w:pPr>
+      <w:r>
+        <w:t>References</w:t>
+      </w:r>
+    </w:p>
+    <w:p>
+      <w:pPr>
+        <w:pStyle w:val="ListParagraph"/>
+        <w:numPr>
+          <w:ilvl w:val="0"/>
+          <w:numId w:val="2"/>
+        </w:numPr>
+      </w:pPr>
+      <w:r>
+        <w:t>Acknowledgement</w:t>
+      </w:r>
+    </w:p>
+    <w:p>
+      <w:pPr>
+        <w:pStyle w:val="ListParagraph"/>
+        <w:numPr>
+          <w:ilvl w:val="0"/>
+          <w:numId w:val="2"/>
+        </w:numPr>
+      </w:pPr>
+      <w:r>
+        <w:t>Source Code</w:t>
       </w:r>
     </w:p>
     <w:p>
@@ -337,7 +485,28 @@
         <w:t xml:space="preserve">Approach </w:t>
       </w:r>
     </w:p>
-    <w:p/>
+    <w:p>
+      <w:r>
+        <w:t>To help us solve this problem we will utilize two machine learning algorithms: Multiple Linear Regression and K-Nearest Neighbors(KNN) Regressor</w:t>
+      </w:r>
+      <w:r>
+        <w:t>, this helps us analyze the used car market form a couple different points of view.</w:t>
+      </w:r>
+      <w:r>
+        <w:t xml:space="preserve"> Linear Regression could help guide our model to observe trends in the overall vehicle market, seeing how price gets </w:t>
+      </w:r>
+      <w:proofErr w:type="gramStart"/>
+      <w:r>
+        <w:t>effected</w:t>
+      </w:r>
+      <w:proofErr w:type="gramEnd"/>
+      <w:r>
+        <w:t xml:space="preserve"> by how old the car is or </w:t>
+      </w:r>
+      <w:r>
+        <w:t>the milage. KNN approaches the problem by averaging out similar vehicles to it, thus finding the most likely average price of a specific vehicle.</w:t>
+      </w:r>
+    </w:p>
     <w:p/>
     <w:p>
       <w:pPr>
@@ -472,6 +641,7 @@
           <w:sz w:val="28"/>
           <w:szCs w:val="28"/>
         </w:rPr>
+        <w:lastRenderedPageBreak/>
         <w:t>Visualization</w:t>
       </w:r>
     </w:p>
@@ -498,11 +668,7 @@
       </w:r>
       <w:proofErr w:type="gramEnd"/>
       <w:r>
-        <w:t xml:space="preserve"> we  take the price and odometer features to how they compare to each other. We </w:t>
-      </w:r>
-      <w:r>
-        <w:lastRenderedPageBreak/>
-        <w:t>create a scatter plot of the two features, sampling 20,000 columns, and see that there is a general downwards trend to the overall data. We see that there is a negative correlation between the milage and the price of the vehicle, the more the odometer shows the lower the price.</w:t>
+        <w:t xml:space="preserve"> we  take the price and odometer features to how they compare to each other. We create a scatter plot of the two features, sampling 20,000 columns, and see that there is a general downwards trend to the overall data. We see that there is a negative correlation between the milage and the price of the vehicle, the more the odometer shows the lower the price.</w:t>
       </w:r>
     </w:p>
     <w:p/>
@@ -747,14 +913,10 @@
           </wp:inline>
         </w:drawing>
       </w:r>
-      <w:r>
-        <w:br w:type="page"/>
-      </w:r>
-    </w:p>
-    <w:p>
-      <w:proofErr w:type="gramStart"/>
-      <w:r>
-        <w:lastRenderedPageBreak/>
+    </w:p>
+    <w:p>
+      <w:proofErr w:type="gramStart"/>
+      <w:r>
         <w:t>Lastly</w:t>
       </w:r>
       <w:proofErr w:type="gramEnd"/>
@@ -841,7 +1003,11 @@
       </w:r>
       <w:proofErr w:type="gramEnd"/>
       <w:r>
-        <w:t xml:space="preserve"> being the most popular, also has the largest spread of price, going all the way up to 100,000. At the same time, salvage, rebuild, and others are mostly squished in the cheaper price range with many being under 20,000. Transmission seems to not have too much a dramatic difference, but noticeable. Automatic transmissions are more common, but also </w:t>
+        <w:t xml:space="preserve"> being the most popular, also has the largest spread of price, going all the way up to 100,000. At the same time, </w:t>
+      </w:r>
+      <w:r>
+        <w:lastRenderedPageBreak/>
+        <w:t xml:space="preserve">salvage, rebuild, and others are mostly squished in the cheaper price range with many being under 20,000. Transmission seems to not have too much a dramatic difference, but noticeable. Automatic transmissions are more common, but also </w:t>
       </w:r>
       <w:proofErr w:type="gramStart"/>
       <w:r>
@@ -932,57 +1098,461 @@
     </w:p>
     <w:p>
       <w:r>
+        <w:t xml:space="preserve">Before we can run our machine learning algorithms/models, we need to clean the data up. </w:t>
+      </w:r>
+      <w:proofErr w:type="gramStart"/>
+      <w:r>
+        <w:t>First</w:t>
+      </w:r>
+      <w:proofErr w:type="gramEnd"/>
+      <w:r>
+        <w:t xml:space="preserve"> we remove the extra columns that we will not use in our algorithms/models, we remove features like </w:t>
+      </w:r>
+      <w:proofErr w:type="spellStart"/>
+      <w:r>
+        <w:t>image_url</w:t>
+      </w:r>
+      <w:proofErr w:type="spellEnd"/>
+      <w:r>
+        <w:t>, id, url, and some others. These features do not provide any valid relationship or connection to the price of the vehicle that we want to predict.</w:t>
+      </w:r>
+      <w:r>
+        <w:t xml:space="preserve"> After running our dataset through the function that drops these features, we go from 28 down to 9 features dropping 19 extras.</w:t>
+      </w:r>
+    </w:p>
+    <w:p>
+      <w:r>
+        <w:t xml:space="preserve">Another thing we can do is filter out the outliers of some of the features, to help with any extreme values skewing with the training of the data. Since we are using a craigslist dataset, sometimes people can post listings and list the price as 0, or put the mileage of the car as 0, or set the year to 1900. These types of listing can skew the entire dataset since a lot of algorithms are sensitive to extreme outliers. After dropping the extra frames, we run the data frame through a filter. Dropping rows that have a </w:t>
+      </w:r>
+      <w:proofErr w:type="gramStart"/>
+      <w:r>
+        <w:t>0 dollar</w:t>
+      </w:r>
+      <w:proofErr w:type="gramEnd"/>
+      <w:r>
+        <w:t xml:space="preserve"> value, 0 mileage, or older than 1980 for the year. This helps save compute when </w:t>
+      </w:r>
+      <w:r>
+        <w:t>training and</w:t>
+      </w:r>
+      <w:r>
+        <w:t xml:space="preserve"> makes the model more resistant to skewing.</w:t>
+      </w:r>
+      <w:r>
+        <w:t xml:space="preserve"> After running the dataset through our filter function, we filter out around 55,000 vehicle listings, which brings out total sample size to 370,000 vehicle listings.</w:t>
+      </w:r>
+    </w:p>
+    <w:p>
+      <w:proofErr w:type="gramStart"/>
+      <w:r>
+        <w:t>Lastly</w:t>
+      </w:r>
+      <w:proofErr w:type="gramEnd"/>
+      <w:r>
+        <w:t xml:space="preserve"> we need to encode our data to be understood by the algorithms we use to train our model. For categorical features like manufacturer, condition, </w:t>
+      </w:r>
+      <w:proofErr w:type="spellStart"/>
+      <w:r>
+        <w:t>title_status</w:t>
+      </w:r>
+      <w:proofErr w:type="spellEnd"/>
+      <w:r>
+        <w:t xml:space="preserve"> and others, we turn them into true or false fields, </w:t>
+      </w:r>
+      <w:r>
+        <w:t>effectually</w:t>
+      </w:r>
+      <w:r>
+        <w:t xml:space="preserve"> achieving </w:t>
+      </w:r>
+      <w:r>
+        <w:t>binary</w:t>
+      </w:r>
+      <w:r>
+        <w:t xml:space="preserve"> 0 or 1 to be used in the </w:t>
+      </w:r>
+      <w:r>
+        <w:t>algorithms</w:t>
+      </w:r>
+      <w:r>
+        <w:t xml:space="preserve">. We do this by </w:t>
+      </w:r>
+      <w:r>
+        <w:t xml:space="preserve">One Hot Encoding using the Pandas library to encode the </w:t>
+      </w:r>
+      <w:r>
         <w:lastRenderedPageBreak/>
-        <w:t xml:space="preserve">Before we can run our machine learning algorithms/models, we need to clean the data up. </w:t>
-      </w:r>
-      <w:proofErr w:type="gramStart"/>
-      <w:r>
-        <w:t>First</w:t>
-      </w:r>
-      <w:proofErr w:type="gramEnd"/>
-      <w:r>
-        <w:t xml:space="preserve"> we remove the extra columns that we will not use in our algorithms/models, we remove features like </w:t>
+        <w:t xml:space="preserve">features, this creates new c0lumbs in the dataset for each variant of the selected features. </w:t>
+      </w:r>
+      <w:proofErr w:type="gramStart"/>
+      <w:r>
+        <w:t>M</w:t>
+      </w:r>
+      <w:r>
+        <w:t>anufacturer</w:t>
+      </w:r>
+      <w:proofErr w:type="gramEnd"/>
+      <w:r>
+        <w:t xml:space="preserve"> </w:t>
+      </w:r>
+      <w:r>
+        <w:t xml:space="preserve">for example, </w:t>
+      </w:r>
+      <w:proofErr w:type="gramStart"/>
+      <w:r>
+        <w:t>creates</w:t>
+      </w:r>
+      <w:proofErr w:type="gramEnd"/>
+      <w:r>
+        <w:t xml:space="preserve"> multiple new columns with every manufacturer found in the data set and assigns it a true of false based on the vehicle listing. Meaning, if the </w:t>
+      </w:r>
+      <w:r>
+        <w:t xml:space="preserve">manufacturer </w:t>
+      </w:r>
+      <w:r>
+        <w:t xml:space="preserve">for a specific listing was ford, this encoding function will create a new column/feature and call it </w:t>
       </w:r>
       <w:proofErr w:type="spellStart"/>
       <w:r>
-        <w:t>image_url</w:t>
+        <w:t>manufacturer_</w:t>
+      </w:r>
+      <w:proofErr w:type="gramStart"/>
+      <w:r>
+        <w:t>ford</w:t>
       </w:r>
       <w:proofErr w:type="spellEnd"/>
       <w:r>
-        <w:t>, id, url, and some others. These features do not provide any valid relationship or connection to the price of the vehicle that we want to predict.</w:t>
-      </w:r>
-    </w:p>
-    <w:p>
-      <w:r>
-        <w:t xml:space="preserve">Another thing we can do is filter out the outliers of some of the features, to help with any extreme values skewing with the training of the data. Since we are using a craigslist dataset, sometimes people can post listings and list the price as 0, or put the mileage of the car as 0, or set the year to 1900. These types of listing can skew the entire dataset since a lot of algorithms are sensitive to extreme outliers. After dropping the extra frames, we run the data frame through a filter. Dropping rows that have a </w:t>
-      </w:r>
-      <w:proofErr w:type="gramStart"/>
-      <w:r>
-        <w:t>0 dollar</w:t>
-      </w:r>
-      <w:proofErr w:type="gramEnd"/>
-      <w:r>
-        <w:t xml:space="preserve"> value, 0 mileage, or older than 1980 for the year. This helps save compute when </w:t>
-      </w:r>
-      <w:proofErr w:type="gramStart"/>
-      <w:r>
-        <w:t>training, and</w:t>
-      </w:r>
-      <w:proofErr w:type="gramEnd"/>
-      <w:r>
-        <w:t xml:space="preserve"> makes the model more resistant to skewing.</w:t>
-      </w:r>
+        <w:t>, and</w:t>
+      </w:r>
+      <w:proofErr w:type="gramEnd"/>
+      <w:r>
+        <w:t xml:space="preserve"> assign true to that specific listing. It does this for every single manufacturer, transmission type, or condition.</w:t>
+      </w:r>
+      <w:r>
+        <w:t xml:space="preserve"> </w:t>
+      </w:r>
+    </w:p>
+    <w:p>
+      <w:r>
+        <w:t xml:space="preserve">We also need to properly scale our numerical </w:t>
+      </w:r>
+      <w:proofErr w:type="gramStart"/>
+      <w:r>
+        <w:t>features</w:t>
+      </w:r>
+      <w:r>
+        <w:t>,</w:t>
+      </w:r>
+      <w:proofErr w:type="gramEnd"/>
+      <w:r>
+        <w:t xml:space="preserve"> we do this by using </w:t>
+      </w:r>
+      <w:proofErr w:type="spellStart"/>
+      <w:r>
+        <w:t>sklearn’s</w:t>
+      </w:r>
+      <w:proofErr w:type="spellEnd"/>
+      <w:r>
+        <w:t xml:space="preserve"> standard scaler class. We need to do this because the scale of the numbers is vastly different, the price could be in the ten </w:t>
+      </w:r>
+      <w:proofErr w:type="gramStart"/>
+      <w:r>
+        <w:t>thousands</w:t>
+      </w:r>
+      <w:proofErr w:type="gramEnd"/>
+      <w:r>
+        <w:t>, while the year could only be a maximum of 2026, this can heavily skew the data and not give us accurate results.</w:t>
+      </w:r>
+      <w:r>
+        <w:tab/>
+      </w:r>
+    </w:p>
+    <w:p/>
+    <w:p/>
+    <w:p>
+      <w:pPr>
+        <w:pStyle w:val="ListParagraph"/>
+        <w:numPr>
+          <w:ilvl w:val="0"/>
+          <w:numId w:val="2"/>
+        </w:numPr>
+        <w:rPr>
+          <w:sz w:val="32"/>
+          <w:szCs w:val="32"/>
+        </w:rPr>
+      </w:pPr>
+      <w:r>
+        <w:rPr>
+          <w:sz w:val="32"/>
+          <w:szCs w:val="32"/>
+        </w:rPr>
+        <w:t>The Method</w:t>
+      </w:r>
+    </w:p>
+    <w:p>
+      <w:pPr>
+        <w:pStyle w:val="ListParagraph"/>
+        <w:numPr>
+          <w:ilvl w:val="1"/>
+          <w:numId w:val="2"/>
+        </w:numPr>
+        <w:rPr>
+          <w:sz w:val="28"/>
+          <w:szCs w:val="28"/>
+        </w:rPr>
+      </w:pPr>
+      <w:r>
+        <w:rPr>
+          <w:sz w:val="28"/>
+          <w:szCs w:val="28"/>
+        </w:rPr>
+        <w:t>Linear Regression</w:t>
+      </w:r>
+    </w:p>
+    <w:p>
+      <w:pPr>
+        <w:rPr>
+          <w:noProof/>
+        </w:rPr>
+      </w:pPr>
+      <w:r>
+        <w:t xml:space="preserve">For the first algorithm, we used a Multiple Linear Regression model to be our baseline for </w:t>
+      </w:r>
+      <w:proofErr w:type="gramStart"/>
+      <w:r>
+        <w:t>the predictions</w:t>
+      </w:r>
+      <w:proofErr w:type="gramEnd"/>
+      <w:r>
+        <w:t xml:space="preserve">. This type of algorithm is a </w:t>
+      </w:r>
+      <w:r>
+        <w:t>s</w:t>
+      </w:r>
+      <w:r>
+        <w:t xml:space="preserve">upervised learning algorithm, specifically made for modeling a relationship of multiple </w:t>
+      </w:r>
+      <w:r>
+        <w:t>independent</w:t>
+      </w:r>
+      <w:r>
+        <w:t xml:space="preserve"> variable or features and a specific dependent variable. Since our main goal is to predict the price of a vehicle, this algorithm is exactly what solves that problem, it compares multiple </w:t>
+      </w:r>
+      <w:r>
+        <w:t>different</w:t>
+      </w:r>
+      <w:r>
+        <w:t xml:space="preserve"> features to the price. </w:t>
+      </w:r>
+      <w:r>
+        <w:t xml:space="preserve">Mathematically the algorithm has the assumption that the relationships between the many features and the main feature, in our case the price, </w:t>
+      </w:r>
+      <w:proofErr w:type="gramStart"/>
+      <w:r>
+        <w:t>is able to</w:t>
+      </w:r>
+      <w:proofErr w:type="gramEnd"/>
+      <w:r>
+        <w:t xml:space="preserve"> be represented by a linear plane. Using this equation:</w:t>
+      </w:r>
+      <w:r>
+        <w:rPr>
+          <w:noProof/>
+        </w:rPr>
+        <w:t xml:space="preserve"> </w:t>
+      </w:r>
+      <w:r>
+        <w:drawing>
+          <wp:inline distT="0" distB="0" distL="0" distR="0" wp14:anchorId="4A7681B2" wp14:editId="3F5A6321">
+            <wp:extent cx="4420217" cy="504895"/>
+            <wp:effectExtent l="0" t="0" r="0" b="9525"/>
+            <wp:docPr id="1266223840" name="Picture 1"/>
+            <wp:cNvGraphicFramePr>
+              <a:graphicFrameLocks xmlns:a="http://schemas.openxmlformats.org/drawingml/2006/main" noChangeAspect="1"/>
+            </wp:cNvGraphicFramePr>
+            <a:graphic xmlns:a="http://schemas.openxmlformats.org/drawingml/2006/main">
+              <a:graphicData uri="http://schemas.openxmlformats.org/drawingml/2006/picture">
+                <pic:pic xmlns:pic="http://schemas.openxmlformats.org/drawingml/2006/picture">
+                  <pic:nvPicPr>
+                    <pic:cNvPr id="1266223840" name=""/>
+                    <pic:cNvPicPr/>
+                  </pic:nvPicPr>
+                  <pic:blipFill>
+                    <a:blip r:embed="rId10"/>
+                    <a:stretch>
+                      <a:fillRect/>
+                    </a:stretch>
+                  </pic:blipFill>
+                  <pic:spPr>
+                    <a:xfrm>
+                      <a:off x="0" y="0"/>
+                      <a:ext cx="4420217" cy="504895"/>
+                    </a:xfrm>
+                    <a:prstGeom prst="rect">
+                      <a:avLst/>
+                    </a:prstGeom>
+                  </pic:spPr>
+                </pic:pic>
+              </a:graphicData>
+            </a:graphic>
+          </wp:inline>
+        </w:drawing>
+      </w:r>
+    </w:p>
+    <w:p>
+      <w:pPr>
+        <w:rPr>
+          <w:noProof/>
+        </w:rPr>
+      </w:pPr>
+      <w:r>
+        <w:rPr>
+          <w:noProof/>
+        </w:rPr>
+        <w:t xml:space="preserve">The B0 is the baseline price when all features are 0, Bn are the actual features, and </w:t>
+      </w:r>
+      <w:r>
+        <w:rPr>
+          <w:noProof/>
+        </w:rPr>
+        <w:t xml:space="preserve">the last term is the error term represneitng natural variance. </w:t>
+      </w:r>
+    </w:p>
+    <w:p/>
+    <w:p>
+      <w:pPr>
+        <w:pStyle w:val="ListParagraph"/>
+        <w:numPr>
+          <w:ilvl w:val="1"/>
+          <w:numId w:val="2"/>
+        </w:numPr>
+        <w:rPr>
+          <w:sz w:val="28"/>
+          <w:szCs w:val="28"/>
+        </w:rPr>
+      </w:pPr>
+      <w:r>
+        <w:rPr>
+          <w:sz w:val="28"/>
+          <w:szCs w:val="28"/>
+        </w:rPr>
+        <w:t>K -Nearest Neighbors</w:t>
+      </w:r>
+    </w:p>
+    <w:p>
+      <w:r>
+        <w:t xml:space="preserve">For the second algorithm, we used K-Nearest Neighbors Regressor(KNN). Instead of going for a global baseline like the previous algorithm, </w:t>
+      </w:r>
+      <w:proofErr w:type="spellStart"/>
+      <w:r>
+        <w:t>knn</w:t>
+      </w:r>
+      <w:proofErr w:type="spellEnd"/>
+      <w:r>
+        <w:t xml:space="preserve"> approaches the data from an instance-based learning way. Instead of drawing out one line to fit all the data as best as it can, </w:t>
+      </w:r>
+      <w:proofErr w:type="spellStart"/>
+      <w:r>
+        <w:t>knn</w:t>
+      </w:r>
+      <w:proofErr w:type="spellEnd"/>
+      <w:r>
+        <w:t xml:space="preserve"> </w:t>
+      </w:r>
+      <w:proofErr w:type="gramStart"/>
+      <w:r>
+        <w:t>makes the assumption</w:t>
+      </w:r>
+      <w:proofErr w:type="gramEnd"/>
+      <w:r>
+        <w:t xml:space="preserve"> that vehicles with similar features are similarly priced. It finds the k number of listings that are similar </w:t>
+      </w:r>
+      <w:proofErr w:type="gramStart"/>
+      <w:r>
+        <w:t>mathematically, and</w:t>
+      </w:r>
+      <w:proofErr w:type="gramEnd"/>
+      <w:r>
+        <w:t xml:space="preserve"> averages the price for </w:t>
+      </w:r>
+      <w:r>
+        <w:lastRenderedPageBreak/>
+        <w:t xml:space="preserve">that specific vehicle with the specific features. </w:t>
+      </w:r>
+      <w:r>
+        <w:t xml:space="preserve"> Mathematically, to determine which vehicles are similar, it calculates the distance between the data in a multidimensional space using the Euclidean distance formula: </w:t>
+      </w:r>
+    </w:p>
+    <w:p>
+      <w:r>
+        <w:drawing>
+          <wp:inline distT="0" distB="0" distL="0" distR="0" wp14:anchorId="4762509C" wp14:editId="21BB49C4">
+            <wp:extent cx="2715004" cy="1095528"/>
+            <wp:effectExtent l="0" t="0" r="9525" b="9525"/>
+            <wp:docPr id="391752780" name="Picture 1"/>
+            <wp:cNvGraphicFramePr>
+              <a:graphicFrameLocks xmlns:a="http://schemas.openxmlformats.org/drawingml/2006/main" noChangeAspect="1"/>
+            </wp:cNvGraphicFramePr>
+            <a:graphic xmlns:a="http://schemas.openxmlformats.org/drawingml/2006/main">
+              <a:graphicData uri="http://schemas.openxmlformats.org/drawingml/2006/picture">
+                <pic:pic xmlns:pic="http://schemas.openxmlformats.org/drawingml/2006/picture">
+                  <pic:nvPicPr>
+                    <pic:cNvPr id="391752780" name=""/>
+                    <pic:cNvPicPr/>
+                  </pic:nvPicPr>
+                  <pic:blipFill>
+                    <a:blip r:embed="rId11"/>
+                    <a:stretch>
+                      <a:fillRect/>
+                    </a:stretch>
+                  </pic:blipFill>
+                  <pic:spPr>
+                    <a:xfrm>
+                      <a:off x="0" y="0"/>
+                      <a:ext cx="2715004" cy="1095528"/>
+                    </a:xfrm>
+                    <a:prstGeom prst="rect">
+                      <a:avLst/>
+                    </a:prstGeom>
+                  </pic:spPr>
+                </pic:pic>
+              </a:graphicData>
+            </a:graphic>
+          </wp:inline>
+        </w:drawing>
+      </w:r>
+    </w:p>
+    <w:p>
+      <w:r>
+        <w:t>In this formula, the q and p are a single feature but in different vehicle listings, while n is the total amount of features we are comparing.</w:t>
+      </w:r>
+      <w:r>
+        <w:t xml:space="preserve"> After the distance is calculated of the different vehicle listings, the algorithm takes the average of the closest K neighbors which gives us the price for that specific vehicle with those features.</w:t>
+      </w:r>
+    </w:p>
+    <w:p/>
+    <w:p/>
+    <w:p/>
+    <w:p/>
+    <w:p/>
+    <w:p/>
+    <w:p/>
+    <w:p/>
+    <w:p>
+      <w:pPr>
+        <w:spacing w:after="0" w:line="240" w:lineRule="auto"/>
+      </w:pPr>
       <w:r>
         <w:br w:type="page"/>
       </w:r>
     </w:p>
+    <w:p/>
     <w:p>
       <w:r>
         <w:rPr>
           <w:sz w:val="36"/>
           <w:szCs w:val="36"/>
         </w:rPr>
-        <w:lastRenderedPageBreak/>
         <w:t>References:</w:t>
       </w:r>
     </w:p>

</xml_diff>